<commit_message>
Correct NFIF rules URL to friidrett.no/om-nfif/lover (per author)
Co-Authored-By: Claude Fable 5 <noreply@anthropic.com>
</commit_message>
<xml_diff>
--- a/forskning/ncc-kohort/submission_pse/MANUSCRIPT_ANONYMIZED.docx
+++ b/forskning/ncc-kohort/submission_pse/MANUSCRIPT_ANONYMIZED.docx
@@ -2933,13 +2933,13 @@
           <w:i/>
           <w:iCs/>
         </w:rPr>
-        <w:t xml:space="preserve">Konkurranseregler og bestemmelser</w:t>
-      </w:r>
-      <w:r>
-        <w:t xml:space="preserve"> </w:t>
-      </w:r>
-      <w:r>
-        <w:t xml:space="preserve">[Competition rules and regulations]. https://www.friidrett.no/lover-og-regler/</w:t>
+        <w:t xml:space="preserve">Lover og regler</w:t>
+      </w:r>
+      <w:r>
+        <w:t xml:space="preserve"> </w:t>
+      </w:r>
+      <w:r>
+        <w:t xml:space="preserve">[Laws and regulations]. https://www.friidrett.no/om-nfif/lover/</w:t>
       </w:r>
     </w:p>
     <w:p>

</xml_diff>

<commit_message>
Remove unnecessary em-dashes throughout manuscript
108 em-dashes rewritten as commas, colons, parentheses, or new
sentences across abstract, intro, methods, results, discussion,
supplementary methods, table notes, and cover letter. Kept: the
title's subtitle separator, empty-cell markers, and en-dashes in
ranges/CIs. Cover letter's stale 'independent birth cohorts' fixed
to 'adjacent' in passing. Zero em-dashes remain in compiled main
text; all builds regenerated (6,036 words Vancouver).

Co-Authored-By: Claude Fable 5 <noreply@anthropic.com>
</commit_message>
<xml_diff>
--- a/forskning/ncc-kohort/submission_pse/MANUSCRIPT_ANONYMIZED.docx
+++ b/forskning/ncc-kohort/submission_pse/MANUSCRIPT_ANONYMIZED.docx
@@ -68,7 +68,7 @@
         <w:pStyle w:val="FirstParagraph"/>
       </w:pPr>
       <w:r>
-        <w:t xml:space="preserve">Withdrawal from youth sport is theorized as a gradual process, but its longitudinal behavioral signature has been hard to observe directly. We used Norway’s national competition register to follow 2,123 athletes who competed as 13–14-year-olds in a regional youth track-and-field meet (birth years 1998–2002) for up to 14 years. In a prospective logistic regression for active senior status (≥2 registered results in a calendar year at age 20+) using only ages-13–14 predictors, competition volume was the dominant predictor (OR = 2.40 per SD, 95% CI [2.08, 2.76]; cross-validated AUC = 0.751; calibration slope 0.96), outperformed age-normed performance measured in the same window, was robust to structural controls and club random effects, and replicated across two adjacent birth cohorts. Exit-aligned trajectories showed that withdrawal was gradual for most athletes: median volume fell 12 → 10 → 9 → 4 meets across dropouts’ last four seasons, 74% of those leaving at 16 or later had a reduced-but-nonzero season before their final season, and among athletes still active at 16, both earlier volume (OR = 3.04) and decline across ages 15–16 (OR = 1.88) predicted senior status. Higher within-sport event concentration predicted higher retention, robust to count-dependence checks — a construct distinct from multisport diversification. A register-based flag at the end of the age-14 season (&lt; 10 meets) identifies the 26% of athletes whose senior retention is 6%, versus 20% among the unflagged (PPV = 0.94 against an 84% base rate; sensitivity 0.30) — a testable targeting rule for retention-supporting outreach in open-entry systems.</w:t>
+        <w:t xml:space="preserve">Withdrawal from youth sport is theorized as a gradual process, but its longitudinal behavioral signature has been hard to observe directly. We used Norway’s national competition register to follow 2,123 athletes who competed as 13–14-year-olds in a regional youth track-and-field meet (birth years 1998–2002) for up to 14 years. In a prospective logistic regression for active senior status (≥2 registered results in a calendar year at age 20+) using only ages-13–14 predictors, competition volume was the dominant predictor (OR = 2.40 per SD, 95% CI [2.08, 2.76]; cross-validated AUC = 0.751; calibration slope 0.96), outperformed age-normed performance measured in the same window, was robust to structural controls and club random effects, and replicated across two adjacent birth cohorts. Exit-aligned trajectories showed that withdrawal was gradual for most athletes: median volume fell 12 → 10 → 9 → 4 meets across dropouts’ last four seasons, 74% of those leaving at 16 or later had a reduced-but-nonzero season before their final season, and among athletes still active at 16, both earlier volume (OR = 3.04) and decline across ages 15–16 (OR = 1.88) predicted senior status. Higher within-sport event concentration predicted higher retention, robust to count-dependence checks, a construct distinct from multisport diversification. A register-based flag at the end of the age-14 season (&lt; 10 meets) identifies the 26% of athletes whose senior retention is 6%, versus 20% among the unflagged (PPV = 0.94 against an 84% base rate; sensitivity 0.30): a testable targeting rule for retention-supporting outreach in open-entry systems.</w:t>
       </w:r>
     </w:p>
     <w:p>
@@ -93,7 +93,7 @@
         <w:pStyle w:val="FirstParagraph"/>
       </w:pPr>
       <w:r>
-        <w:t xml:space="preserve">Organized youth sport is widely promoted for its benefits for physical health, psychosocial development, and social connection (Eime et al., 2013) — benefits that presuppose that young people stay involved. Attrition from organized competition during adolescence is substantial across countries and sports (Crane &amp; Temple, 2015), and track and field is no exception: in a 25-year Norwegian follow-up, roughly 82% of promising track and field athletes identified in adolescence had left the sport within 14 years (Enoksen, 2011), and in the broad-participation cohort studied here, fewer than half of those competing at ages 13–14 were still competing at 17 (Section 3).</w:t>
+        <w:t xml:space="preserve">Organized youth sport is widely promoted for its benefits for physical health, psychosocial development, and social connection (Eime et al., 2013), benefits that presuppose that young people stay involved. Attrition from organized competition during adolescence is substantial across countries and sports (Crane &amp; Temple, 2015), and track and field is no exception: in a 25-year Norwegian follow-up, roughly 82% of promising track and field athletes identified in adolescence had left the sport within 14 years (Enoksen, 2011), and in the broad-participation cohort studied here, fewer than half of those competing at ages 13–14 were still competing at 17 (Section 3).</w:t>
       </w:r>
     </w:p>
     <w:p>
@@ -114,10 +114,7 @@
         <w:t xml:space="preserve">withdrawal</w:t>
       </w:r>
       <w:r>
-        <w:t xml:space="preserve"> </w:t>
-      </w:r>
-      <w:r>
-        <w:t xml:space="preserve">— the gradual process of disengaging from a sport — from</w:t>
+        <w:t xml:space="preserve">, the gradual process of disengaging from a sport, from</w:t>
       </w:r>
       <w:r>
         <w:t xml:space="preserve"> </w:t>
@@ -172,7 +169,7 @@
         <w:pStyle w:val="BodyText"/>
       </w:pPr>
       <w:r>
-        <w:t xml:space="preserve">The most developed account of this process view comes from sociology. Eliasson and Johansson (2021) applied Ebaugh’s (1988) role-exit framework — in which leaving a social role proceeds through stages of first doubts, seeking and weighing alternatives, a turning point, and the construction of an ex-role identity — to youth sport, interviewing adolescent girls and their parents. Withdrawal resulted from interacting changes in the sport organization, the athletes’ broader lives, and the expectations attached to the young-athlete role; the process could be long, emotionally demanding, and decreasingly reversible. Survey evidence from Norwegian youth complements this picture: stated reasons for leaving organized sport are diverse and patterned by social background, with sport expenses cited more often by minority youth from less-resourced families (Espedalen &amp; Seippel, 2024).</w:t>
+        <w:t xml:space="preserve">The most developed account of this process view comes from sociology. Eliasson and Johansson (2021) applied Ebaugh’s (1988) role-exit framework, in which leaving a social role proceeds through stages of first doubts, seeking and weighing alternatives, a turning point, and the construction of an ex-role identity, to youth sport, interviewing adolescent girls and their parents. Withdrawal resulted from interacting changes in the sport organization, the athletes’ broader lives, and the expectations attached to the young-athlete role; the process could be long, emotionally demanding, and decreasingly reversible. Survey evidence from Norwegian youth complements this picture: stated reasons for leaving organized sport are diverse and patterned by social background, with sport expenses cited more often by minority youth from less-resourced families (Espedalen &amp; Seippel, 2024).</w:t>
       </w:r>
     </w:p>
     <w:p>
@@ -192,7 +189,7 @@
         <w:t xml:space="preserve"> </w:t>
       </w:r>
       <w:r>
-        <w:t xml:space="preserve">involvement motives — intense love of the game or career pursuits — while the larger group appreciate</w:t>
+        <w:t xml:space="preserve">involvement motives (intense love of the game or career pursuits), while the larger group appreciate</w:t>
       </w:r>
       <w:r>
         <w:t xml:space="preserve"> </w:t>
@@ -204,7 +201,7 @@
         <w:t xml:space="preserve"> </w:t>
       </w:r>
       <w:r>
-        <w:t xml:space="preserve">involvement built on fun, exercise, and belonging, quitting more readily when sport becomes too demanding alongside everything else (Espedalen, 2025). The Sport Commitment Model’s distinction between enthusiastic and constrained commitment gives such divergent responses a theoretical basis (Scanlan et al., 2016). Consistent with the idea that such differences leave behavioral traces well before exit, retrospective comparisons of developmental activities show that youth ice-hockey players who later dropped out already differed from persisting peers in their earlier training patterns — for example, taking up intense sport-specific off-ice training at younger ages (Wall &amp; Côté, 2007). We therefore expect casually engaged participants to show declining participation through the teenage years, while deeply committed participants sustain theirs.</w:t>
+        <w:t xml:space="preserve">involvement built on fun, exercise, and belonging, quitting more readily when sport becomes too demanding alongside everything else (Espedalen, 2025). The Sport Commitment Model’s distinction between enthusiastic and constrained commitment gives such divergent responses a theoretical basis (Scanlan et al., 2016). Consistent with the idea that such differences leave behavioral traces well before exit, retrospective comparisons of developmental activities show that youth ice-hockey players who later dropped out already differed from persisting peers in their earlier training patterns, for example taking up intense sport-specific off-ice training at younger ages (Wall &amp; Côté, 2007). We therefore expect casually engaged participants to show declining participation through the teenage years, while deeply committed participants sustain theirs.</w:t>
       </w:r>
     </w:p>
     <w:bookmarkEnd w:id="11"/>
@@ -222,7 +219,7 @@
         <w:pStyle w:val="FirstParagraph"/>
       </w:pPr>
       <w:r>
-        <w:t xml:space="preserve">These theories indicate what might happen over time as participants continue or withdraw from their sport(s), but none provides direct longitudinal behavioral evidence. Withdrawn athletes are systematically harder to recruit into surveys (Eime et al., 2013), and the hypothesized timescale (1–3 years) exceeds most prospective follow-up windows — Sarrazin et al.’s (2002) 21-month handball study is unusually long and still does not bridge the adolescent-to-junior transition. A separate quantitative tradition studies correlates of dropout and development — relative age effects (Cobley et al., 2009), specialization (DiFiori et al., 2014; Jayanthi et al., 2015; Côté &amp; Hancock, 2016; Güllich et al., 2022) — and studies of proximal psychological constructs such as burnout, motivation, and peer relations (Kuokkanen et al., 2026; Worley &amp; Smith, 2026; Zhong et al., 2026); prospective predictors of adolescent team-sport dropout have been meta-analyzed (Back et al., 2022), and in athletics, rankings databases have been used to study</w:t>
+        <w:t xml:space="preserve">These theories indicate what might happen over time as participants continue or withdraw from their sport(s), but none provides direct longitudinal behavioral evidence. Withdrawn athletes are systematically harder to recruit into surveys (Eime et al., 2013), and the hypothesized timescale (1–3 years) exceeds most prospective follow-up windows: Sarrazin et al.’s (2002) 21-month handball study is unusually long and still does not bridge the adolescent-to-junior transition. A separate quantitative tradition studies correlates of dropout and development, such as relative age effects (Cobley et al., 2009) and specialization (DiFiori et al., 2014; Jayanthi et al., 2015; Côté &amp; Hancock, 2016; Güllich et al., 2022), and studies of proximal psychological constructs such as burnout, motivation, and peer relations (Kuokkanen et al., 2026; Worley &amp; Smith, 2026; Zhong et al., 2026); prospective predictors of adolescent team-sport dropout have been meta-analyzed (Back et al., 2022), and in athletics, rankings databases have been used to study</w:t>
       </w:r>
       <w:r>
         <w:t xml:space="preserve"> </w:t>
@@ -254,7 +251,7 @@
         <w:t xml:space="preserve"> </w:t>
       </w:r>
       <w:r>
-        <w:t xml:space="preserve">trajectory itself — competition behavior recorded entry by entry — has not, to our knowledge, been examined: an observable proxy for the engagement balance (the net of enjoyment and investment against constraint in the Sport Commitment Model) whose course the qualitative literature describes but cannot measure.</w:t>
+        <w:t xml:space="preserve">trajectory itself, competition behavior recorded entry by entry, has not, to our knowledge, been examined: an observable proxy for the engagement balance (the net of enjoyment and investment against constraint in the Sport Commitment Model) whose course the qualitative literature describes but cannot measure.</w:t>
       </w:r>
     </w:p>
     <w:bookmarkEnd w:id="12"/>
@@ -288,7 +285,7 @@
         <w:t xml:space="preserve"> </w:t>
       </w:r>
       <w:r>
-        <w:t xml:space="preserve">of future retainers and future dropouts would diverge before the final registered season — in two separable forms that we test separately: early between-athlete differences in level, and within-athlete decline. Second, because the determinants of sport commitment are experiential and volitional — enjoyment, investment, alternatives, constraint — rather than ability-based (Scanlan et al., 1993, 2016), we predicted that</w:t>
+        <w:t xml:space="preserve">of future retainers and future dropouts would diverge before the final registered season, in two separable forms that we test separately: early between-athlete differences in level, and within-athlete decline. Second, because the determinants of sport commitment are experiential and volitional (enjoyment, investment, alternatives, constraint) rather than ability-based (Scanlan et al., 1993, 2016), we predicted that</w:t>
       </w:r>
       <w:r>
         <w:t xml:space="preserve"> </w:t>
@@ -320,7 +317,7 @@
         <w:t xml:space="preserve"> </w:t>
       </w:r>
       <w:r>
-        <w:t xml:space="preserve">would. Third — a robustness expectation rather than a theory-derived prediction — the pattern should</w:t>
+        <w:t xml:space="preserve">would. Third, as a robustness expectation rather than a theory-derived prediction, the pattern should</w:t>
       </w:r>
       <w:r>
         <w:t xml:space="preserve"> </w:t>
@@ -352,7 +349,7 @@
         <w:t xml:space="preserve"> </w:t>
       </w:r>
       <w:r>
-        <w:t xml:space="preserve">is an observable behavioral indicator — not a direct measure of motivation — whose temporal structure can be compared with process accounts; convergence between register patterns and the qualitative literature strengthens both.</w:t>
+        <w:t xml:space="preserve">is an observable behavioral indicator, not a direct measure of motivation, whose temporal structure can be compared with process accounts; convergence between register patterns and the qualitative literature strengthens both.</w:t>
       </w:r>
     </w:p>
     <w:p>
@@ -405,15 +402,15 @@
         <w:pStyle w:val="FirstParagraph"/>
       </w:pPr>
       <w:r>
-        <w:t xml:space="preserve">Norwegian youth track and field is organized as a low-threshold, open-entry system. Up to age 15, essentially all meets are open to all club-registered athletes: there are no qualifying standards, no roster selection, and no coach-controlled gatekeeping (Norges Friidrettsforbund, 2026). (The exception — occasional invitational regional-team matches for 14–15-year-olds — does not gate ordinary competition.) Athletes and their families decide which meets and events to enter; entry fees are ordinarily paid by the club, participation is actively encouraged, and travel distances are typically short. The first genuinely selective competition is the national youth championship (Ungdomsmesterskapet, UM), open from the calendar year athletes turn 15, with event-specific qualifying standards. Two design consequences follow: before age 15, meet counts primarily express the athlete’s own choice rather than selection or entry costs — which licenses interpreting ages-13–14 volume as a behavioral indicator of engagement — and the ages-15–16 window coincides with the first selective gate (UM), which is why the pre-milestone (13–14) and milestone (15–16) windows are analyzed separately.</w:t>
-      </w:r>
-    </w:p>
-    <w:p>
-      <w:pPr>
-        <w:pStyle w:val="BodyText"/>
-      </w:pPr>
-      <w:r>
-        <w:t xml:space="preserve">The cohort comprises all athletes who competed in any of six consecutive autumn editions (2011–2016) of a regional grassroots youth meet held simultaneously at three venues in eastern, western, and mid Norway (the last also serving the northern districts). Athletes were 13–14 and were entered by their district federations under district quotas, with no qualifying performance standard and no entry fee; this soft selection into the baseline meet is a design feature — disengagement trajectories arise from a baseline of demonstrable engagement. Birth years were restricted to 1998–2002 (boundary years 1997 and 2003 had only one eligible edition), and athletes appearing in both a 13- and a 14-year-old edition were de-duplicated to the earlier one (Supplementary Figure S0). For cross-cohort replication, participants were partitioned into Cohort A (births 1998–2000, baseline meets 2011–2014; n = 1,301) and Cohort B (births 2001–2002, baseline meets 2014–2016; n = 822). Athletes were retained regardless of club transfers (27.8% recorded results for two or more clubs), so changing club does not register as dropout. The total cohort comprised 2,123 athletes (996 male, 1,103 female, 24 with unknown sex), generating 230,868 competition entries through the most recent register update (April 2026).</w:t>
+        <w:t xml:space="preserve">Norwegian youth track and field is organized as a low-threshold, open-entry system. Up to age 15, essentially all meets are open to all club-registered athletes: there are no qualifying standards, no roster selection, and no coach-controlled gatekeeping (Norges Friidrettsforbund, 2026). (The exception, occasional invitational regional-team matches for 14–15-year-olds, does not gate ordinary competition.) Athletes and their families decide which meets and events to enter; entry fees are ordinarily paid by the club, participation is actively encouraged, and travel distances are typically short. The first genuinely selective competition is the national youth championship (Ungdomsmesterskapet, UM), open from the calendar year athletes turn 15, with event-specific qualifying standards. Two design consequences follow: before age 15, meet counts primarily express the athlete’s own choice rather than selection or entry costs, which licenses interpreting ages-13–14 volume as a behavioral indicator of engagement; and the ages-15–16 window coincides with the first selective gate (UM), which is why the pre-milestone (13–14) and milestone (15–16) windows are analyzed separately.</w:t>
+      </w:r>
+    </w:p>
+    <w:p>
+      <w:pPr>
+        <w:pStyle w:val="BodyText"/>
+      </w:pPr>
+      <w:r>
+        <w:t xml:space="preserve">The cohort comprises all athletes who competed in any of six consecutive autumn editions (2011–2016) of a regional grassroots youth meet held simultaneously at three venues in eastern, western, and mid Norway (the last also serving the northern districts). Athletes were 13–14 and were entered by their district federations under district quotas, with no qualifying performance standard and no entry fee; this soft selection into the baseline meet is a design feature: disengagement trajectories arise from a baseline of demonstrable engagement. Birth years were restricted to 1998–2002 (boundary years 1997 and 2003 had only one eligible edition), and athletes appearing in both a 13- and a 14-year-old edition were de-duplicated to the earlier one (Supplementary Figure S0). For cross-cohort replication, participants were partitioned into Cohort A (births 1998–2000, baseline meets 2011–2014; n = 1,301) and Cohort B (births 2001–2002, baseline meets 2014–2016; n = 822). Athletes were retained regardless of club transfers (27.8% recorded results for two or more clubs), so changing club does not register as dropout. The total cohort comprised 2,123 athletes (996 male, 1,103 female, 24 with unknown sex), generating 230,868 competition entries through the most recent register update (April 2026).</w:t>
       </w:r>
     </w:p>
     <w:bookmarkEnd w:id="16"/>
@@ -597,7 +594,7 @@
         </m:r>
       </m:oMath>
       <w:r>
-        <w:t xml:space="preserve">. HHI ranges from 1/k (fully diversified) to 1 (single category). Key variables: hhi_early (first three active seasons), hhi_age_15, and their change. Combined events appear in the register both as a total and as separate constituent results; constituents are counted in their natural categories (multi-event athletes register as diversified; stand-alone combined rows &lt;0.1%). Categories co-occur unevenly (sprints and hurdles share training demands; throws transfer little); the HHI treats them symmetrically — see the limitations.</w:t>
+        <w:t xml:space="preserve">. HHI ranges from 1/k (fully diversified) to 1 (single category). Key variables: hhi_early (first three active seasons), hhi_age_15, and their change. Combined events appear in the register both as a total and as separate constituent results; constituents are counted in their natural categories (multi-event athletes register as diversified; stand-alone combined rows &lt;0.1%). Categories co-occur unevenly (sprints and hurdles share training demands; throws transfer little); the HHI treats them symmetrically (see the limitations).</w:t>
       </w:r>
     </w:p>
     <w:bookmarkEnd w:id="20"/>
@@ -615,7 +612,7 @@
         <w:pStyle w:val="FirstParagraph"/>
       </w:pPr>
       <w:r>
-        <w:t xml:space="preserve">For each athlete and age-year from 13 to 18 we counted distinct meets attended (vol_age_X; a multi-event competition counts as one meet) and total results (res_age_X, which also define active seasons: ≥2 results in a calendar year). Composites: vol_pre_milestone (meets at 13–14), vol_milestone (15–16), their difference, and n_champ_types (championship types before 17) — observable behavioral markers, not direct measures of motivation or commitment.</w:t>
+        <w:t xml:space="preserve">For each athlete and age-year from 13 to 18 we counted distinct meets attended (vol_age_X; a multi-event competition counts as one meet) and total results (res_age_X, which also define active seasons: ≥2 results in a calendar year). Composites: vol_pre_milestone (meets at 13–14), vol_milestone (15–16), their difference, and n_champ_types (championship types before 17). These are observable behavioral markers, not direct measures of motivation or commitment.</w:t>
       </w:r>
     </w:p>
     <w:bookmarkEnd w:id="21"/>
@@ -733,7 +730,7 @@
         <w:pStyle w:val="FirstParagraph"/>
       </w:pPr>
       <w:r>
-        <w:t xml:space="preserve">Because the design observes the full eligible population, classical a-priori power analysis does not apply; a detection-capacity analysis (Supplementary Methods; Supplementary Table S4) shows the design could detect hazard ratios ≥1.07 and odds ratios ≥1.20 per SD — well below effect sizes typical of prior dropout research (Back et al., 2022). Missing values (Tyrving ~20%, HHI ~10%) were handled by complete-case analysis (n = 1,704), with multiple imputation (m = 20, Rubin-pooled) as the principal sensitivity plus included-versus-excluded comparison, mean imputation, and club-clustered standard errors (Supplementary Tables S21, S25, S5, S2; sample flow: Supplementary Table S12). Club-level confounding was probed via the intraclass correlation of volume across baseline clubs and a refit with club random intercepts (Supplementary Table S22). The primary and secondary models were re-estimated separately by birth cohort.</w:t>
+        <w:t xml:space="preserve">Because the design observes the full eligible population, classical a-priori power analysis does not apply; a detection-capacity analysis (Supplementary Methods; Supplementary Table S4) shows the design could detect hazard ratios ≥1.07 and odds ratios ≥1.20 per SD, well below effect sizes typical of prior dropout research (Back et al., 2022). Missing values (Tyrving ~20%, HHI ~10%) were handled by complete-case analysis (n = 1,704), with multiple imputation (m = 20, Rubin-pooled) as the principal sensitivity plus included-versus-excluded comparison, mean imputation, and club-clustered standard errors (Supplementary Tables S21, S25, S5, S2; sample flow: Supplementary Table S12). Club-level confounding was probed via the intraclass correlation of volume across baseline clubs and a refit with club random intercepts (Supplementary Table S22). The primary and secondary models were re-estimated separately by birth cohort.</w:t>
       </w:r>
     </w:p>
     <w:bookmarkEnd w:id="28"/>
@@ -782,7 +779,7 @@
         <w:t xml:space="preserve"> </w:t>
       </w:r>
       <w:r>
-        <w:t xml:space="preserve">reflects the federation’s binary registration variable — the register holds no gender-identity information.</w:t>
+        <w:t xml:space="preserve">reflects the federation’s binary registration variable; the register holds no gender-identity information.</w:t>
       </w:r>
     </w:p>
     <w:bookmarkEnd w:id="31"/>
@@ -871,15 +868,15 @@
         <w:pStyle w:val="FirstParagraph"/>
       </w:pPr>
       <w:r>
-        <w:t xml:space="preserve">Figure 2 presents the central behavioral observation (Figure 1 shows the conceptual model): median competitions per year by age, plotted separately for eventual retainers (n = 348) and non-retainers (n = 1,775). The groups already differ at baseline — medians of 13 vs. 8 meets at age 13, and 17 vs. 8 at age 14 — and from age 15 they diverge sharply: retainers peak at 19 meets and sustain that level through 17, while future dropouts fall from 8 to 3 to 0. Baseline differences and within-athlete pull-back are separated formally in Section 3.5.</w:t>
-      </w:r>
-    </w:p>
-    <w:p>
-      <w:pPr>
-        <w:pStyle w:val="BodyText"/>
-      </w:pPr>
-      <w:r>
-        <w:t xml:space="preserve">Kaplan–Meier curves summarize the attrition (medians in Table 2): half the cohort ceased active competition within 3 years, 75% within 5, steepest at age 17 — the youth-to-junior transition (Supplementary Figure S2). Sex-stratified curves overlap (log-rank χ² = 0.95,</w:t>
+        <w:t xml:space="preserve">Figure 2 presents the central behavioral observation (Figure 1 shows the conceptual model): median competitions per year by age, plotted separately for eventual retainers (n = 348) and non-retainers (n = 1,775). The groups already differ at baseline (medians of 13 vs. 8 meets at age 13, and 17 vs. 8 at age 14), and from age 15 they diverge sharply: retainers peak at 19 meets and sustain that level through 17, while future dropouts fall from 8 to 3 to 0. Baseline differences and within-athlete pull-back are separated formally in Section 3.5.</w:t>
+      </w:r>
+    </w:p>
+    <w:p>
+      <w:pPr>
+        <w:pStyle w:val="BodyText"/>
+      </w:pPr>
+      <w:r>
+        <w:t xml:space="preserve">Kaplan–Meier curves summarize the attrition (medians in Table 2): half the cohort ceased active competition within 3 years, 75% within 5, steepest at age 17, the youth-to-junior transition (Supplementary Figure S2). Sex-stratified curves overlap (log-rank χ² = 0.95,</w:t>
       </w:r>
       <w:r>
         <w:t xml:space="preserve"> </w:t>
@@ -895,7 +892,7 @@
         <w:t xml:space="preserve"> </w:t>
       </w:r>
       <w:r>
-        <w:t xml:space="preserve">= .33). Stratifying descriptively by ages-15–16 volume yields monotonically separated curves — 71% senior retention with ≥31 meets vs. 4% with none (Figure 3) — and stratifying by pre-17 championship types shows the same pattern (Supplementary Figure S3). Formal estimates use baseline-only predictors below.</w:t>
+        <w:t xml:space="preserve">= .33). Stratifying descriptively by ages-15–16 volume yields monotonically separated curves, 71% senior retention with ≥31 meets vs. 4% with none (Figure 3), and stratifying by pre-17 championship types shows the same pattern (Supplementary Figure S3). Formal estimates use baseline-only predictors below.</w:t>
       </w:r>
     </w:p>
     <w:p>
@@ -1039,7 +1036,7 @@
         <w:t xml:space="preserve"> </w:t>
       </w:r>
       <w:r>
-        <w:t xml:space="preserve">&lt; .001) —</w:t>
+        <w:t xml:space="preserve">&lt; .001):</w:t>
       </w:r>
       <w:r>
         <w:t xml:space="preserve"> </w:t>
@@ -1142,7 +1139,7 @@
           <w:b/>
           <w:bCs/>
         </w:rPr>
-        <w:t xml:space="preserve">Early behavioral heterogeneity and within-athlete pull-back contribute independently — they are not substitutes.</w:t>
+        <w:t xml:space="preserve">Early behavioral heterogeneity and within-athlete pull-back contribute independently; they are not substitutes.</w:t>
       </w:r>
       <w:r>
         <w:t xml:space="preserve"> </w:t>
@@ -1206,15 +1203,15 @@
         <w:t xml:space="preserve"> </w:t>
       </w:r>
       <w:r>
-        <w:t xml:space="preserve">&lt; .001) predicted senior status four or more years later (CV-AUC = 0.758) — decline predicts exit among athletes who are all, at measurement, still active.</w:t>
-      </w:r>
-    </w:p>
-    <w:p>
-      <w:pPr>
-        <w:pStyle w:val="BodyText"/>
-      </w:pPr>
-      <w:r>
-        <w:t xml:space="preserve">Third, exit-aligned trajectories. Aligned to each dropout’s own final active season (n = 1,139 with final seasons at ages 15–19), median volumes at T−3, T−2, T−1, and T were 12, 10, 9, and 4 meets — a within-athlete taper, not a cliff. 95% were still competing in their penultimate season; among final seasons at 16+ (n = 795), 74% showed a</w:t>
+        <w:t xml:space="preserve">&lt; .001) predicted senior status four or more years later (CV-AUC = 0.758): decline predicts exit among athletes who are all, at measurement, still active.</w:t>
+      </w:r>
+    </w:p>
+    <w:p>
+      <w:pPr>
+        <w:pStyle w:val="BodyText"/>
+      </w:pPr>
+      <w:r>
+        <w:t xml:space="preserve">Third, exit-aligned trajectories. Aligned to each dropout’s own final active season (n = 1,139 with final seasons at ages 15–19), median volumes at T−3, T−2, T−1, and T were 12, 10, 9, and 4 meets, a within-athlete taper rather than a cliff. 95% were still competing in their penultimate season; among final seasons at 16+ (n = 795), 74% showed a</w:t>
       </w:r>
       <w:r>
         <w:t xml:space="preserve"> </w:t>
@@ -1266,7 +1263,7 @@
         <w:pStyle w:val="FirstParagraph"/>
       </w:pPr>
       <w:r>
-        <w:t xml:space="preserve">In a fully time-aligned comparison — behavior and performance both measured at ages 13–14, removing any temporal advantage — behavior still discriminates better: AUC = 0.607 for sex + baseline Tyrving, 0.740 for sex + ages-13–14 volume, 0.737 for both combined (Supplementary Table S15). A within-baseline performance</w:t>
+        <w:t xml:space="preserve">In a fully time-aligned comparison, with behavior and performance both measured at ages 13–14 to remove any temporal advantage, behavior still discriminates better: AUC = 0.607 for sex + baseline Tyrving, 0.740 for sex + ages-13–14 volume, 0.737 for both combined (Supplementary Table S15). A within-baseline performance</w:t>
       </w:r>
       <w:r>
         <w:t xml:space="preserve"> </w:t>
@@ -1282,7 +1279,7 @@
         <w:t xml:space="preserve"> </w:t>
       </w:r>
       <w:r>
-        <w:t xml:space="preserve">(Tyrving change from 13 to 14) raised the performance-only AUC only to 0.640 (n = 1,350) — still well short of volume.</w:t>
+        <w:t xml:space="preserve">(Tyrving change from 13 to 14) raised the performance-only AUC only to 0.640 (n = 1,350), still well short of volume.</w:t>
       </w:r>
     </w:p>
     <w:p>
@@ -1306,7 +1303,7 @@
         <w:t xml:space="preserve"> </w:t>
       </w:r>
       <w:r>
-        <w:t xml:space="preserve">performance strata: splitting the cohort by baseline-Tyrving quartile and pre-milestone volume (above/below median), above-median volume was associated with higher senior retention in every quartile — 16.3% vs. 10.0% in the lowest-performing quartile, 18.0% vs. 4.2%, 25.8% vs. 4.7%, and 34.1% vs. 13.2% in the highest. Volume is related to, but clearly not reducible to, performance level.</w:t>
+        <w:t xml:space="preserve">performance strata: splitting the cohort by baseline-Tyrving quartile and pre-milestone volume (above/below median), above-median volume was associated with higher senior retention in every quartile: 16.3% vs. 10.0% in the lowest-performing quartile, then 18.0% vs. 4.2%, 25.8% vs. 4.7%, and 34.1% vs. 13.2% in the highest. Volume is related to, but clearly not reducible to, performance level.</w:t>
       </w:r>
     </w:p>
     <w:bookmarkEnd w:id="39"/>
@@ -1360,7 +1357,7 @@
         <w:pStyle w:val="FirstParagraph"/>
       </w:pPr>
       <w:r>
-        <w:t xml:space="preserve">Because the primary analysis uses only baseline-window data, a prospective rule can be evaluated at the end of the age-14 season (Table 6, with bootstrap CIs). At a moderate threshold (vol &lt; 10 meets across ages 13–14, flagging 26.4%), senior retention was 5.7% among flagged athletes versus 20.2% among unflagged — a 3.5-fold difference in retention prospects (PPV = 0.94, sensitivity = 0.30). Lower thresholds (&lt; 5; 9.3% flagged) suit targeted outreach, higher (&lt; 15; 43.1%) broaden the screen. Two properties discipline use: PPV partly reflects the 84% base rate (~10-point precision gain), and NPV = 0.20 means unflagged athletes are</w:t>
+        <w:t xml:space="preserve">Because the primary analysis uses only baseline-window data, a prospective rule can be evaluated at the end of the age-14 season (Table 6, with bootstrap CIs). At a moderate threshold (vol &lt; 10 meets across ages 13–14, flagging 26.4%), senior retention was 5.7% among flagged athletes versus 20.2% among unflagged, a 3.5-fold difference in retention prospects (PPV = 0.94, sensitivity = 0.30). Lower thresholds (&lt; 5; 9.3% flagged) suit targeted outreach, higher (&lt; 15; 43.1%) broaden the screen. Two properties discipline use: PPV partly reflects the 84% base rate (~10-point precision gain), and NPV = 0.20 means unflagged athletes are</w:t>
       </w:r>
       <w:r>
         <w:t xml:space="preserve"> </w:t>
@@ -1379,10 +1376,7 @@
         <w:t xml:space="preserve">“safe”</w:t>
       </w:r>
       <w:r>
-        <w:t xml:space="preserve"> </w:t>
-      </w:r>
-      <w:r>
-        <w:t xml:space="preserve">— four in five also fail to retain. The flag concentrates risk; it certifies no one’s continuation.</w:t>
+        <w:t xml:space="preserve">: four in five also fail to retain. The flag concentrates risk; it certifies no one’s continuation.</w:t>
       </w:r>
     </w:p>
     <w:p>
@@ -1466,7 +1460,7 @@
         <w:t xml:space="preserve"> </w:t>
       </w:r>
       <w:r>
-        <w:t xml:space="preserve">track and field — a different construct from multisport diversification; the distinction is developed in §4.6.</w:t>
+        <w:t xml:space="preserve">track and field, a different construct from multisport diversification; the distinction is developed in §4.6.</w:t>
       </w:r>
     </w:p>
     <w:bookmarkEnd w:id="42"/>
@@ -1518,7 +1512,15 @@
         <w:t xml:space="preserve">Table 7 about here</w:t>
       </w:r>
       <w:r>
-        <w:t xml:space="preserve">] On the primary specification, the effect was robust to outcome definition (OR = 2.29, 2.40, 2.26 across the three definitions; Supplementary Table S9), to the fixed-window outcome (ages 20–22: OR = 2.43; Supplementary Table S24), to multiple imputation (OR = 2.34, 95% CI [2.07, 2.66]; Supplementary Table S21), and to cluster-robust standard errors (Supplementary Table S2). For unmeasured confounding, converting the primary odds ratio for this common outcome to a risk ratio (≈1.55) gives an E-value of 2.5 (baseline-only Cox: 2.6; Supplementary Table S3): a confounder would need risk-ratio associations of ≈2.5 with both early volume and retention — stronger than any measured covariate — to fully explain the association.</w:t>
+        <w:t xml:space="preserve">]</w:t>
+      </w:r>
+    </w:p>
+    <w:p>
+      <w:pPr>
+        <w:pStyle w:val="BodyText"/>
+      </w:pPr>
+      <w:r>
+        <w:t xml:space="preserve">On the primary specification, the effect was robust to outcome definition (OR = 2.29, 2.40, 2.26 across the three definitions; Supplementary Table S9), to the fixed-window outcome (ages 20–22: OR = 2.43; Supplementary Table S24), to multiple imputation (OR = 2.34, 95% CI [2.07, 2.66]; Supplementary Table S21), and to cluster-robust standard errors (Supplementary Table S2). For unmeasured confounding, converting the primary odds ratio for this common outcome to a risk ratio (≈1.55) gives an E-value of 2.5 (baseline-only Cox: 2.6; Supplementary Table S3): a confounder would need risk-ratio associations of ≈2.5 with both early volume and retention, stronger than any measured covariate, to fully explain the association.</w:t>
       </w:r>
     </w:p>
     <w:p>
@@ -1553,7 +1555,7 @@
         <w:pStyle w:val="FirstParagraph"/>
       </w:pPr>
       <w:r>
-        <w:t xml:space="preserve">Four findings emerge from this 14-year follow-up of 2,123 young athletes. First, competition volume at ages 13–14 was strongly and prospectively associated with retaining senior competition. Second, the association replicated across both birth cohorts and withstood structural controls, club random effects, and multiple imputation. Third, the dropout signal decomposed into two independent components — early behavioral heterogeneity visible at 13–14, and a genuine within-athlete pull-back: exit-aligned trajectories showed most dropouts tapering (median 12 → 10 → 9 → 4 meets across their last four seasons), and decline predicted exit even among athletes all still active at 16. Fourth, higher event-category concentration within track and field was associated with higher retention, robust to count-dependence checks — a different construct from, not a contradiction of, multisport diversification (§4.6).</w:t>
+        <w:t xml:space="preserve">Four findings emerge from this 14-year follow-up of 2,123 young athletes. First, competition volume at ages 13–14 was strongly and prospectively associated with retaining senior competition. Second, the association replicated across both birth cohorts and withstood structural controls, club random effects, and multiple imputation. Third, the dropout signal decomposed into two independent components: early behavioral heterogeneity visible at 13–14, and a genuine within-athlete pull-back. Exit-aligned trajectories showed most dropouts tapering (median 12 → 10 → 9 → 4 meets across their last four seasons), and decline predicted exit even among athletes all still active at 16. Fourth, higher event-category concentration within track and field was associated with higher retention, robust to count-dependence checks; this is a different construct from, not a contradiction of, multisport diversification (§4.6).</w:t>
       </w:r>
     </w:p>
     <w:bookmarkEnd w:id="45"/>
@@ -1587,7 +1589,7 @@
         <w:t xml:space="preserve"> </w:t>
       </w:r>
       <w:r>
-        <w:t xml:space="preserve">closed the gap only slightly (0.640). Performance reflects capability; volume reflects the athlete’s own choices about taking part — licensed by the open-entry structure of Section 2.2 — and those choices matter more for disengagement than capability does. Two caveats: volume is a near-noiseless count while Tyrving is a scored maximum with ~20% missingness, so part of the gap could be measurement precision (the within-stratum effects argue not all of it); and predictor and outcome both index registered activity, so</w:t>
+        <w:t xml:space="preserve">closed the gap only slightly (0.640). Performance reflects capability; volume reflects the athlete’s own choices about taking part (licensed by the open-entry structure of Section 2.2), and those choices matter more for disengagement than capability does. Two caveats: volume is a near-noiseless count while Tyrving is a scored maximum with ~20% missingness, so part of the gap could be measurement precision (the within-stratum effects argue not all of it); and predictor and outcome both index registered activity, so</w:t>
       </w:r>
       <w:r>
         <w:t xml:space="preserve"> </w:t>
@@ -1623,7 +1625,7 @@
         <w:t xml:space="preserve"> </w:t>
       </w:r>
       <w:r>
-        <w:t xml:space="preserve">sport expenses are cited as a dropout reason more often by Norwegian minority youth from less-resourced families (Espedalen &amp; Seippel, 2024); the channel is attenuated here — clubs pay entry fees, travel is short — but not eliminated, and the register holds no socioeconomic data.</w:t>
+        <w:t xml:space="preserve">sport expenses are cited as a dropout reason more often by Norwegian minority youth from less-resourced families (Espedalen &amp; Seippel, 2024); the channel is attenuated here (clubs pay entry fees, travel is short) but not eliminated, and the register holds no socioeconomic data.</w:t>
       </w:r>
       <w:r>
         <w:t xml:space="preserve"> </w:t>
@@ -1652,10 +1654,7 @@
         <w:t xml:space="preserve">Periodization</w:t>
       </w:r>
       <w:r>
-        <w:t xml:space="preserve"> </w:t>
-      </w:r>
-      <w:r>
-        <w:t xml:space="preserve">— competing less to peak later — is unlikely: the decline spans successive calendar years and ends in exit, not a peak.</w:t>
+        <w:t xml:space="preserve">, competing less in order to peak later, is unlikely: the decline spans successive calendar years and ends in exit, not a peak.</w:t>
       </w:r>
     </w:p>
     <w:bookmarkEnd w:id="46"/>
@@ -1665,15 +1664,15 @@
         <w:pStyle w:val="Heading2"/>
       </w:pPr>
       <w:r>
-        <w:t xml:space="preserve">4.3 Pull-back is real at the individual level — and so is early heterogeneity</w:t>
-      </w:r>
-    </w:p>
-    <w:p>
-      <w:pPr>
-        <w:pStyle w:val="FirstParagraph"/>
-      </w:pPr>
-      <w:r>
-        <w:t xml:space="preserve">Is the divergence in Figure 2 genuine within-athlete pull-back, or early differentiation only — or an artifact of averaging abrupt exits at heterogeneous ages? The exit-aligned analyses answer at the individual level: 95% of dropouts were still competing in their penultimate season, 74% had a reduced-but-nonzero penultimate season, and only 19% exited directly from peak volume — a two-to-three-season taper, not a cliff. Both components are nonetheless real: level and change carried independent information (Table 4), the pattern held in the contamination-free window (level OR = 3.04; change OR = 1.88), and future dropouts already differed at 13–14 — consistent with retrospective evidence that dropouts’ developmental activities differ years before exit (Wall &amp; Côté, 2007).</w:t>
+        <w:t xml:space="preserve">4.3 Pull-back is real at the individual level, and so is early heterogeneity</w:t>
+      </w:r>
+    </w:p>
+    <w:p>
+      <w:pPr>
+        <w:pStyle w:val="FirstParagraph"/>
+      </w:pPr>
+      <w:r>
+        <w:t xml:space="preserve">Is the divergence in Figure 2 genuine within-athlete pull-back, or early differentiation only, or an artifact of averaging abrupt exits at heterogeneous ages? The exit-aligned analyses answer at the individual level: 95% of dropouts were still competing in their penultimate season, 74% had a reduced-but-nonzero penultimate season, and only 19% exited directly from peak volume. The typical exit is a two-to-three-season taper, not a cliff. Both components are nonetheless real: level and change carried independent information (Table 4), the pattern held in the contamination-free window (level OR = 3.04; change OR = 1.88), and future dropouts already differed at 13–14, consistent with retrospective evidence that dropouts’ developmental activities differ years before exit (Wall &amp; Côté, 2007).</w:t>
       </w:r>
     </w:p>
     <w:bookmarkEnd w:id="47"/>
@@ -1723,7 +1722,7 @@
         <w:t xml:space="preserve"> </w:t>
       </w:r>
       <w:r>
-        <w:t xml:space="preserve">commitment — the latter less sustainable and linked to burnout (Raedeke, 1997). Declining volume years before exit fits an eroding commitment balance, though the register cannot distinguish waning enthusiasm from accumulating constraint. Withdrawal-as-process accounts (Ebaugh, 1988; Eliasson &amp; Johansson, 2021) describe leaving as a gradual deliberative passage — first doubts, weighing of alternatives, a turning point — among athletes who remain formally involved: precisely what the exit-aligned trajectories show, a typical future dropout still competing, at reduced volume, for two to three seasons before the final exit. The register cannot observe the deliberation, but it can now observe its behavioral shape — two to three thinning seasons — at the individual level.</w:t>
+        <w:t xml:space="preserve">commitment, the latter less sustainable and linked to burnout (Raedeke, 1997). Declining volume years before exit fits an eroding commitment balance, though the register cannot distinguish waning enthusiasm from accumulating constraint. Withdrawal-as-process accounts (Ebaugh, 1988; Eliasson &amp; Johansson, 2021) describe leaving as a gradual deliberative passage (first doubts, weighing of alternatives, a turning point) among athletes who remain formally involved: precisely what the exit-aligned trajectories show, a typical future dropout still competing, at reduced volume, for two to three seasons before the final exit. The register cannot observe the deliberation, but it can now observe its behavioral shape, two to three thinning seasons, at the individual level.</w:t>
       </w:r>
     </w:p>
     <w:p>
@@ -1744,10 +1743,7 @@
         <w:t xml:space="preserve">disengagement from sport</w:t>
       </w:r>
       <w:r>
-        <w:t xml:space="preserve"> </w:t>
-      </w:r>
-      <w:r>
-        <w:t xml:space="preserve">— the commitment-erosion reading. It may also mark</w:t>
+        <w:t xml:space="preserve">, the commitment-erosion reading. It may also mark</w:t>
       </w:r>
       <w:r>
         <w:t xml:space="preserve"> </w:t>
@@ -1760,7 +1756,7 @@
         <w:t xml:space="preserve">engagement reallocation</w:t>
       </w:r>
       <w:r>
-        <w:t xml:space="preserve">: ages 14–16 are precisely when Norwegian multi-sport youth consolidate into one sport, so for some athletes declining track-and-field volume signals rising commitment to handball or football rather than to nothing — the developmentally appropriate transitions that Battaglia et al. (2024) argue the dropout-as-crisis framing wrongly pathologizes. The register cannot separate the two, and the reallocation share is unbounded in our data. Norwegian participation research is compatible with both: involvement is strongly stratified, from heavy to light (Bakken, 2019; Espedalen, 2025), and exit from organized sport can itself reclaim time and autonomy rather than mark a loss (Espedalen, 2025). What the register demonstrates is that</w:t>
+        <w:t xml:space="preserve">: ages 14–16 are precisely when Norwegian multi-sport youth consolidate into one sport, so for some athletes declining track-and-field volume signals rising commitment to handball or football rather than to nothing: the developmentally appropriate transitions that Battaglia et al. (2024) argue the dropout-as-crisis framing wrongly pathologizes. The register cannot separate the two, and the reallocation share is unbounded in our data. Norwegian participation research is compatible with both: involvement is strongly stratified, from heavy to light (Bakken, 2019; Espedalen, 2025), and exit from organized sport can itself reclaim time and autonomy rather than mark a loss (Espedalen, 2025). What the register demonstrates is that</w:t>
       </w:r>
       <w:r>
         <w:t xml:space="preserve"> </w:t>
@@ -1776,7 +1772,7 @@
         <w:t xml:space="preserve"> </w:t>
       </w:r>
       <w:r>
-        <w:t xml:space="preserve">mechanism — erosion, reallocation, or constraint — leaves a footprint readable in registered activity years before exit.</w:t>
+        <w:t xml:space="preserve">mechanism (erosion, reallocation, or constraint) leaves a footprint readable in registered activity years before exit.</w:t>
       </w:r>
     </w:p>
     <w:bookmarkEnd w:id="48"/>
@@ -1810,7 +1806,7 @@
         <w:t xml:space="preserve"> </w:t>
       </w:r>
       <w:r>
-        <w:t xml:space="preserve">= .33); adjusted, females retained at significantly lower odds in every layer of the primary model (OR = 0.72 sex-only, 0.60 full model; Table 3) —</w:t>
+        <w:t xml:space="preserve">= .33); adjusted, females retained at significantly lower odds in every layer of the primary model (OR = 0.72 sex-only, 0.60 full model; Table 3):</w:t>
       </w:r>
       <w:r>
         <w:t xml:space="preserve"> </w:t>
@@ -1823,7 +1819,7 @@
         <w:t xml:space="preserve">conditional on the same early volume, concentration, and performance</w:t>
       </w:r>
       <w:r>
-        <w:t xml:space="preserve">, girls were less likely to remain, their higher early volumes partially masking the gap in unadjusted comparisons. The behavioral mechanism itself was similar across sexes (Supplementary Table S7): milestone-window volume reduced cessation hazard similarly for males (HR = 0.43) and females (HR = 0.45), C-index 0.843 for each — the residual sex effect operates</w:t>
+        <w:t xml:space="preserve">, girls were less likely to remain, their higher early volumes partially masking the gap in unadjusted comparisons. The behavioral mechanism itself was similar across sexes (Supplementary Table S7): milestone-window volume reduced cessation hazard similarly for males (HR = 0.43) and females (HR = 0.45), C-index 0.843 for each, so the residual sex effect operates</w:t>
       </w:r>
       <w:r>
         <w:t xml:space="preserve"> </w:t>
@@ -1896,10 +1892,7 @@
         <w:t xml:space="preserve">across sports</w:t>
       </w:r>
       <w:r>
-        <w:t xml:space="preserve"> </w:t>
-      </w:r>
-      <w:r>
-        <w:t xml:space="preserve">— sampling versus single-sport specialization and its consequences for elite performance and health (Côté &amp; Hancock, 2016; Güllich et al., 2022). Our HHI measures concentration</w:t>
+        <w:t xml:space="preserve">: sampling versus single-sport specialization and its consequences for elite performance and health (Côté &amp; Hancock, 2016; Güllich et al., 2022). Our HHI measures concentration</w:t>
       </w:r>
       <w:r>
         <w:t xml:space="preserve"> </w:t>
@@ -1915,7 +1908,7 @@
         <w:t xml:space="preserve"> </w:t>
       </w:r>
       <w:r>
-        <w:t xml:space="preserve">one sport, conditional on already participating in it, and the register says nothing about other sports: an athlete concentrated within track and field may simultaneously be a multisport sampler. The constructs are related but not interchangeable — and the across-sport evidence is itself less settled than often assumed: in youth swimming, early-specialization markers were, contrary to expectation,</w:t>
+        <w:t xml:space="preserve">one sport, conditional on already participating in it, and the register says nothing about other sports: an athlete concentrated within track and field may simultaneously be a multisport sampler. The constructs are related but not interchangeable, and the across-sport evidence is itself less settled than often assumed: in youth swimming, early-specialization markers were, contrary to expectation,</w:t>
       </w:r>
       <w:r>
         <w:t xml:space="preserve"> </w:t>
@@ -1931,7 +1924,7 @@
         <w:t xml:space="preserve"> </w:t>
       </w:r>
       <w:r>
-        <w:t xml:space="preserve">positively related to burnout and dropout (Larson et al., 2019), and blanket condemnation of early specialization has been argued to outrun the evidence (Baker et al., 2021) — both consistent with our within-sport result. The outcome also differs (retention at 20, not elite performance), and HHI is not a proxy for main-event performance (r = −0.05; coefficient unchanged when primary-category Tyrving is added; Supplementary Table S18). Governing bodies should read this neither as a license to push early specialization nor as grounds for forced diversification among motivated adolescents.</w:t>
+        <w:t xml:space="preserve">positively related to burnout and dropout (Larson et al., 2019), and blanket condemnation of early specialization has been argued to outrun the evidence (Baker et al., 2021). Both findings are consistent with our within-sport result. The outcome also differs (retention at 20, not elite performance), and HHI is not a proxy for main-event performance (r = −0.05; coefficient unchanged when primary-category Tyrving is added; Supplementary Table S18). Governing bodies should read this neither as a license to push early specialization nor as grounds for forced diversification among motivated adolescents.</w:t>
       </w:r>
     </w:p>
     <w:bookmarkEnd w:id="50"/>
@@ -1949,7 +1942,7 @@
         <w:pStyle w:val="FirstParagraph"/>
       </w:pPr>
       <w:r>
-        <w:t xml:space="preserve">Registers address two structural problems in dropout research — withdrawn athletes are hard to recruit, and retrospective accounts compress a continuous process into a remembered decision — by providing a complete population and continuous rather than reconstructed behavioral sequences. Registers bring no new theory; they bring a longitudinal behavioral test of theories built largely on cross-sectional or short-prospective evidence — here a well-calibrated baseline-only signal (AUC = 0.751), internal replication, robustness across structural, club-level, and missing-data checks, and an E-value of ≈2.5.</w:t>
+        <w:t xml:space="preserve">Registers address two structural problems in dropout research: withdrawn athletes are hard to recruit, and retrospective accounts compress a continuous process into a remembered decision. Registration records provide a complete population and continuous rather than reconstructed behavioral sequences. Registers bring no new theory; they bring a longitudinal behavioral test of theories built largely on cross-sectional or short-prospective evidence: here a well-calibrated baseline-only signal (AUC = 0.751), internal replication, robustness across structural, club-level, and missing-data checks, and an E-value of ≈2.5.</w:t>
       </w:r>
     </w:p>
     <w:bookmarkEnd w:id="51"/>
@@ -1996,7 +1989,7 @@
         <w:t xml:space="preserve"> </w:t>
       </w:r>
       <w:r>
-        <w:t xml:space="preserve">retention support would reach and how early — whether such support works is the pilot question in §4.10. Four implications follow.</w:t>
+        <w:t xml:space="preserve">retention support would reach and how early; whether such support works is the pilot question in §4.10. Four implications follow.</w:t>
       </w:r>
     </w:p>
     <w:p>
@@ -2014,7 +2007,7 @@
         <w:t xml:space="preserve"> </w:t>
       </w:r>
       <w:r>
-        <w:t xml:space="preserve">Flag athletes whose ages-13–14 competition count falls below a threshold. At &lt; 10 meets, the flag captures 26% of the cohort whose senior retention is 5.7%, versus 20.2% among the unflagged — a 3.5-fold difference, computed automatically from data the federation already holds (Table 6). Every flagged athlete is low-but-active (cohort entry guarantees a baseline meet), so the flag list is an outreach list, and the same threshold behaves similarly against an activity-at-17 outcome (14% vs 51% still active) — it serves the adolescent-exit target as well as the senior one. Two numbers discipline its use: sensitivity is 0.30, so most future dropouts are</w:t>
+        <w:t xml:space="preserve">Flag athletes whose ages-13–14 competition count falls below a threshold. At &lt; 10 meets, the flag captures 26% of the cohort whose senior retention is 5.7%, versus 20.2% among the unflagged, a 3.5-fold difference computed automatically from data the federation already holds (Table 6). Every flagged athlete is low-but-active (cohort entry guarantees a baseline meet), so the flag list is an outreach list, and the same threshold behaves similarly against an activity-at-17 outcome (14% vs 51% still active), so it serves the adolescent-exit target as well as the senior one. Two numbers discipline its use: sensitivity is 0.30, so most future dropouts are</w:t>
       </w:r>
       <w:r>
         <w:t xml:space="preserve"> </w:t>
@@ -2030,7 +2023,7 @@
         <w:t xml:space="preserve"> </w:t>
       </w:r>
       <w:r>
-        <w:t xml:space="preserve">flagged, and unflagged athletes’ own retention is only ~20% — a flag concentrates risk; its absence reassures no one. Flagging should therefore</w:t>
+        <w:t xml:space="preserve">flagged, and unflagged athletes’ own retention is only ~20%. A flag concentrates risk; its absence reassures no one. Flagging should therefore</w:t>
       </w:r>
       <w:r>
         <w:t xml:space="preserve"> </w:t>
@@ -2064,7 +2057,7 @@
         <w:t xml:space="preserve"> </w:t>
       </w:r>
       <w:r>
-        <w:t xml:space="preserve">Level and change carry independent information (Section 3.5): screen on level at end of age 14 and on change at end of age 15 — the latter just after the first selective gate and ahead of the steepest attrition at 17.</w:t>
+        <w:t xml:space="preserve">Level and change carry independent information (Section 3.5): screen on level at end of age 14 and on change at end of age 15, the latter just after the first selective gate and ahead of the steepest attrition at 17.</w:t>
       </w:r>
     </w:p>
     <w:p>
@@ -2076,13 +2069,13 @@
           <w:b/>
           <w:bCs/>
         </w:rPr>
-        <w:t xml:space="preserve">(3) Lower the cost side of the next competition cycle — as an offer, never as pressure.</w:t>
-      </w:r>
-      <w:r>
-        <w:t xml:space="preserve"> </w:t>
-      </w:r>
-      <w:r>
-        <w:t xml:space="preserve">With entry fees club-paid and travel short (Section 2.2), the remaining levers are residual and psychological costs: membership and equipment support, coach-accompanied transport, low-stakes practice meets, and an explicit signal that participation is welcome regardless of performance — each acting on the cost side of the engagement balance (Scanlan et al., 1993, 2016). The register cannot distinguish athletes who are blocked from athletes choosing other priorities, and for the latter — a large group by design in a low-threshold system — retention pressure would be misplaced. Flags identify</w:t>
+        <w:t xml:space="preserve">(3) Lower the cost side of the next competition cycle, as an offer and never as pressure.</w:t>
+      </w:r>
+      <w:r>
+        <w:t xml:space="preserve"> </w:t>
+      </w:r>
+      <w:r>
+        <w:t xml:space="preserve">With entry fees club-paid and travel short (Section 2.2), the remaining levers are residual and psychological costs: membership and equipment support, coach-accompanied transport, low-stakes practice meets, and an explicit signal that participation is welcome regardless of performance, each acting on the cost side of the engagement balance (Scanlan et al., 1993, 2016). The register cannot distinguish athletes who are blocked from athletes choosing other priorities, and for the latter, a large group by design in a low-threshold system, retention pressure would be misplaced. Flags identify</w:t>
       </w:r>
       <w:r>
         <w:t xml:space="preserve"> </w:t>
@@ -2166,7 +2159,7 @@
         <w:t xml:space="preserve"> </w:t>
       </w:r>
       <w:r>
-        <w:t xml:space="preserve">Operational flagging means algorithmic risk-profiling of minors, and the research-ethics exemption this study relies on (Section 2.7) licenses none of it. Deployment would require a federation’s own legal basis and a data-protection impact assessment; flags visible to a designated officer rather than routinely to coaches (avoiding expectancy and labeling effects); informed families with an opt-out; a retention limit for flag data; and attention to equity, which the register cannot audit for lack of socioeconomic data. That the screen runs without athlete contact is a transparency problem to solve, not a feature. And the flag must be support-only: the same list that identifies whom to help could identify whom a stretched club quietly deprioritizes — deployment must rule that use out. These preconditions, and the untested intervention effect, are why the next step is the pilot of §4.10 rather than adoption.</w:t>
+        <w:t xml:space="preserve">Operational flagging means algorithmic risk-profiling of minors, and the research-ethics exemption this study relies on (Section 2.7) licenses none of it. Deployment would require a federation’s own legal basis and a data-protection impact assessment; flags visible to a designated officer rather than routinely to coaches (avoiding expectancy and labeling effects); informed families with an opt-out; a retention limit for flag data; and attention to equity, which the register cannot audit for lack of socioeconomic data. That the screen runs without athlete contact is a transparency problem to solve, not a feature. And the flag must be support-only: the same list that identifies whom to help could identify whom a stretched club quietly deprioritizes, and deployment must rule that use out. These preconditions, and the untested intervention effect, are why the next step is the pilot of §4.10 rather than adoption.</w:t>
       </w:r>
     </w:p>
     <w:bookmarkEnd w:id="52"/>
@@ -2197,7 +2190,7 @@
         <w:t xml:space="preserve">attrition from track-and-field competition</w:t>
       </w:r>
       <w:r>
-        <w:t xml:space="preserve">, not from sport: a sport-switcher counts as a dropout, and the reallocation share is unbounded (§4.4). Second, the register records official results, not subjective experience — nor injury, a leading cause of attrition in this sport (Enoksen, 2011), so part of the pull-back is plausibly non-volitional; the qualitative literature remains essential for</w:t>
+        <w:t xml:space="preserve">, not from sport: a sport-switcher counts as a dropout, and the reallocation share is unbounded (§4.4). Second, the register records official results, not subjective experience, nor injury, a leading cause of attrition in this sport (Enoksen, 2011); part of the pull-back is therefore plausibly non-volitional, and the qualitative literature remains essential for</w:t>
       </w:r>
       <w:r>
         <w:t xml:space="preserve"> </w:t>
@@ -2213,7 +2206,7 @@
         <w:t xml:space="preserve"> </w:t>
       </w:r>
       <w:r>
-        <w:t xml:space="preserve">volume declines. Third, the population is soft-selected through club membership and district entry, and the three venues cover eastern, western, and mid Norway, with northern districts served by the mid-Norway venue. Fourth, predictor and outcome share a measurement scale; despite the baseline-only model, the contamination-free change model, exit-aligned trajectories, and landmark and zero-volume sensitivities, structural overlap remains a conceptual limitation of register-only designs. Fifth, the post-baseline Cox specification violated proportional hazards (Schoenfeld χ² = 220.77); its estimates are descriptive only. Sixth, the HHI treats event categories symmetrically although they co-occur unevenly (98% of hurdlers also sprinted), so identical values can represent different combination patterns; the direction of the association was nonetheless robust. Seventh, the youngest cohort has at most four post-senior years of observation, though the fixed-window outcome gives near-identical results. Eighth, on the applied side: the thresholds are calibrated to a complete-register, open-entry, club-pays system and do not transfer to coach-gated or pay-to-play systems without re-derivation — and no intervention effect has been demonstrated: §4.8 is targeting logic, not evaluated policy.</w:t>
+        <w:t xml:space="preserve">volume declines. Third, the population is soft-selected through club membership and district entry, and the three venues cover eastern, western, and mid Norway, with northern districts served by the mid-Norway venue. Fourth, predictor and outcome share a measurement scale; despite the baseline-only model, the contamination-free change model, exit-aligned trajectories, and landmark and zero-volume sensitivities, structural overlap remains a conceptual limitation of register-only designs. Fifth, the post-baseline Cox specification violated proportional hazards (Schoenfeld χ² = 220.77); its estimates are descriptive only. Sixth, the HHI treats event categories symmetrically although they co-occur unevenly (98% of hurdlers also sprinted), so identical values can represent different combination patterns; the direction of the association was nonetheless robust. Seventh, the youngest cohort has at most four post-senior years of observation, though the fixed-window outcome gives near-identical results. Eighth, on the applied side: the thresholds are calibrated to a complete-register, open-entry, club-pays system and do not transfer to coach-gated or pay-to-play systems without re-derivation, and no intervention effect has been demonstrated: §4.8 is targeting logic, not evaluated policy.</w:t>
       </w:r>
     </w:p>
     <w:bookmarkEnd w:id="53"/>
@@ -2249,7 +2242,7 @@
         <w:pStyle w:val="FirstParagraph"/>
       </w:pPr>
       <w:r>
-        <w:t xml:space="preserve">Senior retention in Norwegian youth track and field is prospectively associated with baseline-window competition behavior: athletes who already compete more at ages 13–14 retain at substantially higher rates, and those who decline retain at substantially lower rates — a decline visible within athletes, years before exit, and no averaging artifact. The effect withstands structural, club-level, missing-data, and outcome-definition checks and replicates across cohorts; early heterogeneity and pull-back contribute independently. The findings are consistent with — though do not by themselves confirm — accounts of withdrawal as a gradual deliberative process, and they yield a register-implementable targeting rule whose intervention value, under the governance preconditions above, is now a testable question.</w:t>
+        <w:t xml:space="preserve">Senior retention in Norwegian youth track and field is prospectively associated with baseline-window competition behavior: athletes who already compete more at ages 13–14 retain at substantially higher rates, and those who decline retain at substantially lower rates. The decline is visible within athletes, years before exit, and is no averaging artifact. The effect withstands structural, club-level, missing-data, and outcome-definition checks and replicates across cohorts; early heterogeneity and pull-back contribute independently. The findings are consistent with, though do not by themselves confirm, accounts of withdrawal as a gradual deliberative process, and they yield a register-implementable targeting rule whose intervention value, under the governance preconditions above, is now a testable question.</w:t>
       </w:r>
     </w:p>
     <w:p>

</xml_diff>